<commit_message>
docs: 연구제안서 v4 — Figure 4개 삽입 (Re:ward 스타일)
- Figure 1 (§1.1): 카디널리티 추정 오차 비교 막대그래프
- Figure 2 (§1.2): Exqutor ECQO/Adaptive Sampling 아키텍처
- Figure 3 (§2): Cascaded Decomposition 2단계 구조도
- Figure 4 (§3): 3단계 실험 파이프라인 흐름도

Co-Authored-By: Claude Opus 4.6 (1M context) <noreply@anthropic.com>
</commit_message>
<xml_diff>
--- a/submission/속도는벡터_연구제안서.docx
+++ b/submission/속도는벡터_연구제안서.docx
@@ -682,6 +682,70 @@
     </w:p>
     <w:p>
       <w:pPr>
+        <w:spacing w:after="40" w:before="160"/>
+        <w:jc w:val="center"/>
+      </w:pPr>
+      <w:r>
+        <w:drawing>
+          <wp:inline distT="0" distB="0" distL="0" distR="0">
+            <wp:extent cx="5143500" cy="2190750"/>
+            <wp:effectExtent t="0" r="0" b="0" l="0"/>
+            <wp:docPr id="1" name="" descr="" title=""/>
+            <wp:cNvGraphicFramePr>
+              <a:graphicFrameLocks xmlns:a="http://schemas.openxmlformats.org/drawingml/2006/main" noChangeAspect="1"/>
+            </wp:cNvGraphicFramePr>
+            <a:graphic xmlns:a="http://schemas.openxmlformats.org/drawingml/2006/main">
+              <a:graphicData uri="http://schemas.openxmlformats.org/drawingml/2006/picture">
+                <pic:pic xmlns:pic="http://schemas.openxmlformats.org/drawingml/2006/picture">
+                  <pic:nvPicPr>
+                    <pic:cNvPr id="0" name="" descr=""/>
+                    <pic:cNvPicPr>
+                      <a:picLocks noChangeAspect="1" noChangeArrowheads="1"/>
+                    </pic:cNvPicPr>
+                  </pic:nvPicPr>
+                  <pic:blipFill>
+                    <a:blip r:embed="rId8" cstate="none"/>
+                    <a:srcRect/>
+                    <a:stretch>
+                      <a:fillRect/>
+                    </a:stretch>
+                  </pic:blipFill>
+                  <pic:spPr bwMode="auto">
+                    <a:xfrm>
+                      <a:off x="0" y="0"/>
+                      <a:ext cx="5143500" cy="2190750"/>
+                    </a:xfrm>
+                    <a:prstGeom prst="rect">
+                      <a:avLst/>
+                    </a:prstGeom>
+                  </pic:spPr>
+                </pic:pic>
+              </a:graphicData>
+            </a:graphic>
+          </wp:inline>
+        </w:drawing>
+      </w:r>
+    </w:p>
+    <w:p>
+      <w:pPr>
+        <w:spacing w:after="200" w:before="80"/>
+        <w:jc w:val="center"/>
+      </w:pPr>
+      <w:r>
+        <w:rPr>
+          <w:rFonts w:ascii="맑은 고딕" w:cs="맑은 고딕" w:eastAsia="맑은 고딕" w:hAnsi="맑은 고딕"/>
+          <w:b w:val="false"/>
+          <w:bCs w:val="false"/>
+          <w:i w:val="false"/>
+          <w:iCs w:val="false"/>
+          <w:sz w:val="19"/>
+          <w:szCs w:val="19"/>
+        </w:rPr>
+        <w:t xml:space="preserve">Figure 1. 주요 벡터 DB 시스템의 고정 카디널리티 추정치와 실제 선택도 범위의 괴리. pgvector(33.3%), VBASE(50%), DuckDB(100%)는 모두 실제 선택도(0.001%~90%)와 큰 차이를 보인다.</w:t>
+      </w:r>
+    </w:p>
+    <w:p>
+      <w:pPr>
         <w:spacing w:after="80" w:before="240"/>
         <w:ind w:left="240"/>
         <w:jc w:val="left"/>
@@ -763,6 +827,70 @@
           <w:szCs w:val="21"/>
         </w:rPr>
         <w:t xml:space="preserve">은 인덱스가 없을 때 모멘텀 기반 동적 샘플링으로 카디널리티를 근사한다. 그 결과 pgvector에서 최대 1,000배, VBASE에서 10,000배, DuckDB에서 1.5~37배의 성능 향상을 달성했다.</w:t>
+      </w:r>
+    </w:p>
+    <w:p>
+      <w:pPr>
+        <w:spacing w:after="40" w:before="160"/>
+        <w:jc w:val="center"/>
+      </w:pPr>
+      <w:r>
+        <w:drawing>
+          <wp:inline distT="0" distB="0" distL="0" distR="0">
+            <wp:extent cx="5143500" cy="2381250"/>
+            <wp:effectExtent t="0" r="0" b="0" l="0"/>
+            <wp:docPr id="1" name="" descr="" title=""/>
+            <wp:cNvGraphicFramePr>
+              <a:graphicFrameLocks xmlns:a="http://schemas.openxmlformats.org/drawingml/2006/main" noChangeAspect="1"/>
+            </wp:cNvGraphicFramePr>
+            <a:graphic xmlns:a="http://schemas.openxmlformats.org/drawingml/2006/main">
+              <a:graphicData uri="http://schemas.openxmlformats.org/drawingml/2006/picture">
+                <pic:pic xmlns:pic="http://schemas.openxmlformats.org/drawingml/2006/picture">
+                  <pic:nvPicPr>
+                    <pic:cNvPr id="0" name="" descr=""/>
+                    <pic:cNvPicPr>
+                      <a:picLocks noChangeAspect="1" noChangeArrowheads="1"/>
+                    </pic:cNvPicPr>
+                  </pic:nvPicPr>
+                  <pic:blipFill>
+                    <a:blip r:embed="rId9" cstate="none"/>
+                    <a:srcRect/>
+                    <a:stretch>
+                      <a:fillRect/>
+                    </a:stretch>
+                  </pic:blipFill>
+                  <pic:spPr bwMode="auto">
+                    <a:xfrm>
+                      <a:off x="0" y="0"/>
+                      <a:ext cx="5143500" cy="2381250"/>
+                    </a:xfrm>
+                    <a:prstGeom prst="rect">
+                      <a:avLst/>
+                    </a:prstGeom>
+                  </pic:spPr>
+                </pic:pic>
+              </a:graphicData>
+            </a:graphic>
+          </wp:inline>
+        </w:drawing>
+      </w:r>
+    </w:p>
+    <w:p>
+      <w:pPr>
+        <w:spacing w:after="200" w:before="80"/>
+        <w:jc w:val="center"/>
+      </w:pPr>
+      <w:r>
+        <w:rPr>
+          <w:rFonts w:ascii="맑은 고딕" w:cs="맑은 고딕" w:eastAsia="맑은 고딕" w:hAnsi="맑은 고딕"/>
+          <w:b w:val="false"/>
+          <w:bCs w:val="false"/>
+          <w:i w:val="false"/>
+          <w:iCs w:val="false"/>
+          <w:sz w:val="19"/>
+          <w:szCs w:val="19"/>
+        </w:rPr>
+        <w:t xml:space="preserve">Figure 2. Exqutor의 두 가지 카디널리티 추정 해법. HNSW 인덱스 존재 시 ECQO로 정확한 카디널리티를 획득하고, 부재 시 Adaptive Sampling으로 근사한다. 이를 통해 옵티마이저가 올바른 실행 계획을 선택한다 [1].</w:t>
       </w:r>
     </w:p>
     <w:p>
@@ -1581,6 +1709,70 @@
     </w:p>
     <w:p>
       <w:pPr>
+        <w:spacing w:after="40" w:before="160"/>
+        <w:jc w:val="center"/>
+      </w:pPr>
+      <w:r>
+        <w:drawing>
+          <wp:inline distT="0" distB="0" distL="0" distR="0">
+            <wp:extent cx="5143500" cy="2762250"/>
+            <wp:effectExtent t="0" r="0" b="0" l="0"/>
+            <wp:docPr id="1" name="" descr="" title=""/>
+            <wp:cNvGraphicFramePr>
+              <a:graphicFrameLocks xmlns:a="http://schemas.openxmlformats.org/drawingml/2006/main" noChangeAspect="1"/>
+            </wp:cNvGraphicFramePr>
+            <a:graphic xmlns:a="http://schemas.openxmlformats.org/drawingml/2006/main">
+              <a:graphicData uri="http://schemas.openxmlformats.org/drawingml/2006/picture">
+                <pic:pic xmlns:pic="http://schemas.openxmlformats.org/drawingml/2006/picture">
+                  <pic:nvPicPr>
+                    <pic:cNvPr id="0" name="" descr=""/>
+                    <pic:cNvPicPr>
+                      <a:picLocks noChangeAspect="1" noChangeArrowheads="1"/>
+                    </pic:cNvPicPr>
+                  </pic:nvPicPr>
+                  <pic:blipFill>
+                    <a:blip r:embed="rId10" cstate="none"/>
+                    <a:srcRect/>
+                    <a:stretch>
+                      <a:fillRect/>
+                    </a:stretch>
+                  </pic:blipFill>
+                  <pic:spPr bwMode="auto">
+                    <a:xfrm>
+                      <a:off x="0" y="0"/>
+                      <a:ext cx="5143500" cy="2762250"/>
+                    </a:xfrm>
+                    <a:prstGeom prst="rect">
+                      <a:avLst/>
+                    </a:prstGeom>
+                  </pic:spPr>
+                </pic:pic>
+              </a:graphicData>
+            </a:graphic>
+          </wp:inline>
+        </w:drawing>
+      </w:r>
+    </w:p>
+    <w:p>
+      <w:pPr>
+        <w:spacing w:after="200" w:before="80"/>
+        <w:jc w:val="center"/>
+      </w:pPr>
+      <w:r>
+        <w:rPr>
+          <w:rFonts w:ascii="맑은 고딕" w:cs="맑은 고딕" w:eastAsia="맑은 고딕" w:hAnsi="맑은 고딕"/>
+          <w:b w:val="false"/>
+          <w:bCs w:val="false"/>
+          <w:i w:val="false"/>
+          <w:iCs w:val="false"/>
+          <w:sz w:val="19"/>
+          <w:szCs w:val="19"/>
+        </w:rPr>
+        <w:t xml:space="preserve">Figure 3. Cascaded Vector Similarity Decomposition의 2단계 분해 구조. Stage 1은 느슨한 임계값(D_loose)으로 후보 집합을 생성하여 추정 오차를 구조적으로 최소화하고, Stage 2는 실체화된 결과 내에서 정밀 필터링을 수행한다.</w:t>
+      </w:r>
+    </w:p>
+    <w:p>
+      <w:pPr>
         <w:spacing w:after="60" w:before="0"/>
       </w:pPr>
       <w:r>
@@ -1630,6 +1822,70 @@
           <w:szCs w:val="21"/>
         </w:rPr>
         <w:t xml:space="preserve">본 연구는 세 개의 연구 질문(RQ)에 대응하는 3단계 실험으로 구성된다. 실험 데이터셋은 TPC-H SF1에 SIFT1M(128차원, 100만 벡터)을 매핑한 VAQ 벤치마크를 기본으로 사용하며, PostgreSQL 16 + pgvector 0.7.x 환경에서 수행한다.</w:t>
+      </w:r>
+    </w:p>
+    <w:p>
+      <w:pPr>
+        <w:spacing w:after="40" w:before="160"/>
+        <w:jc w:val="center"/>
+      </w:pPr>
+      <w:r>
+        <w:drawing>
+          <wp:inline distT="0" distB="0" distL="0" distR="0">
+            <wp:extent cx="5143500" cy="1905000"/>
+            <wp:effectExtent t="0" r="0" b="0" l="0"/>
+            <wp:docPr id="1" name="" descr="" title=""/>
+            <wp:cNvGraphicFramePr>
+              <a:graphicFrameLocks xmlns:a="http://schemas.openxmlformats.org/drawingml/2006/main" noChangeAspect="1"/>
+            </wp:cNvGraphicFramePr>
+            <a:graphic xmlns:a="http://schemas.openxmlformats.org/drawingml/2006/main">
+              <a:graphicData uri="http://schemas.openxmlformats.org/drawingml/2006/picture">
+                <pic:pic xmlns:pic="http://schemas.openxmlformats.org/drawingml/2006/picture">
+                  <pic:nvPicPr>
+                    <pic:cNvPr id="0" name="" descr=""/>
+                    <pic:cNvPicPr>
+                      <a:picLocks noChangeAspect="1" noChangeArrowheads="1"/>
+                    </pic:cNvPicPr>
+                  </pic:nvPicPr>
+                  <pic:blipFill>
+                    <a:blip r:embed="rId11" cstate="none"/>
+                    <a:srcRect/>
+                    <a:stretch>
+                      <a:fillRect/>
+                    </a:stretch>
+                  </pic:blipFill>
+                  <pic:spPr bwMode="auto">
+                    <a:xfrm>
+                      <a:off x="0" y="0"/>
+                      <a:ext cx="5143500" cy="1905000"/>
+                    </a:xfrm>
+                    <a:prstGeom prst="rect">
+                      <a:avLst/>
+                    </a:prstGeom>
+                  </pic:spPr>
+                </pic:pic>
+              </a:graphicData>
+            </a:graphic>
+          </wp:inline>
+        </w:drawing>
+      </w:r>
+    </w:p>
+    <w:p>
+      <w:pPr>
+        <w:spacing w:after="200" w:before="80"/>
+        <w:jc w:val="center"/>
+      </w:pPr>
+      <w:r>
+        <w:rPr>
+          <w:rFonts w:ascii="맑은 고딕" w:cs="맑은 고딕" w:eastAsia="맑은 고딕" w:hAnsi="맑은 고딕"/>
+          <w:b w:val="false"/>
+          <w:bCs w:val="false"/>
+          <w:i w:val="false"/>
+          <w:iCs w:val="false"/>
+          <w:sz w:val="19"/>
+          <w:szCs w:val="19"/>
+        </w:rPr>
+        <w:t xml:space="preserve">Figure 4. 3단계 실험 파이프라인. 1단계(RQ1)의 선택도 sweep 결과가 2단계(RQ2)의 D_loose 파라미터 결정에 직접 활용되며, 3단계(RQ3)에서 ECQO와의 상호작용을 최종 판별한다.</w:t>
       </w:r>
     </w:p>
     <w:p>

</xml_diff>